<commit_message>
Rewrite resume: scraper work under internship, plainer professional tone, ATS-friendly
Co-authored-by: Cursor <cursoragent@cursor.com>
</commit_message>
<xml_diff>
--- a/Sameer_Asif_Resume.docx
+++ b/Sameer_Asif_Resume.docx
@@ -2,7 +2,7 @@
 <file path=word/document.xml><?xml version="1.0" encoding="utf-8"?>
 <w:document xmlns:w="http://schemas.openxmlformats.org/wordprocessingml/2006/main" xmlns:m="http://schemas.openxmlformats.org/officeDocument/2006/math" xmlns:r="http://schemas.openxmlformats.org/officeDocument/2006/relationships" xmlns:o="urn:schemas-microsoft-com:office:office" xmlns:v="urn:schemas-microsoft-com:vml" xmlns:w10="urn:schemas-microsoft-com:office:word" xmlns:a="http://schemas.openxmlformats.org/drawingml/2006/main" xmlns:pic="http://schemas.openxmlformats.org/drawingml/2006/picture" xmlns:wp="http://schemas.openxmlformats.org/drawingml/2006/wordprocessingDrawing">
   <w:body>
-    <w:bookmarkStart w:id="25" w:name="sameer-asif"/>
+    <w:bookmarkStart w:id="24" w:name="sameer-asif"/>
     <w:p>
       <w:pPr>
         <w:pStyle w:val="Heading1"/>
@@ -78,7 +78,7 @@
         <w:pStyle w:val="FirstParagraph"/>
       </w:pPr>
       <w:r>
-        <w:t xml:space="preserve">AI Engineer and final-year BS Artificial Intelligence student at FAST-NUCES, building production LLM and RAG systems at Infigo Solutions. Experienced across the full lifecycle: data scraping and pipelines, model training (GANs, U-Nets, Transformers) in PyTorch, ONNX deployment, FastAPI services, and Postgres/SQL Server databases.</w:t>
+        <w:t xml:space="preserve">Software and AI engineer and final-year BS Artificial Intelligence student at FAST-NUCES, currently building and maintaining production systems at Infigo Solutions. Comfortable across the full stack, from data pipelines and web scraping to backend APIs, databases, and machine learning models, with a focus on shipping work from prototype to deployment.</w:t>
       </w:r>
     </w:p>
     <w:bookmarkEnd w:id="12"/>
@@ -110,7 +110,7 @@
         <w:t xml:space="preserve"> </w:t>
       </w:r>
       <w:r>
-        <w:t xml:space="preserve">Python, SQL, C/C++, JavaScript/TypeScript, Bash</w:t>
+        <w:t xml:space="preserve">Python, SQL, C/C++, JavaScript, TypeScript, Bash</w:t>
       </w:r>
     </w:p>
     <w:p>
@@ -126,13 +126,13 @@
           <w:b/>
           <w:bCs/>
         </w:rPr>
-        <w:t xml:space="preserve">AI / ML:</w:t>
-      </w:r>
-      <w:r>
-        <w:t xml:space="preserve"> </w:t>
-      </w:r>
-      <w:r>
-        <w:t xml:space="preserve">PyTorch, Hugging Face Transformers, GANs, U-Net, EfficientNet, multi-task learning, self-attention, RAG, pgvector, LoRA/SFT, prompt engineering</w:t>
+        <w:t xml:space="preserve">Backend &amp; Data:</w:t>
+      </w:r>
+      <w:r>
+        <w:t xml:space="preserve"> </w:t>
+      </w:r>
+      <w:r>
+        <w:t xml:space="preserve">FastAPI, REST APIs, WebSockets, async Python, Playwright, SQL Server, PostgreSQL, SQLAlchemy, pandas, NumPy</w:t>
       </w:r>
     </w:p>
     <w:p>
@@ -148,13 +148,13 @@
           <w:b/>
           <w:bCs/>
         </w:rPr>
-        <w:t xml:space="preserve">CV / Speech / NLP:</w:t>
-      </w:r>
-      <w:r>
-        <w:t xml:space="preserve"> </w:t>
-      </w:r>
-      <w:r>
-        <w:t xml:space="preserve">OpenCV, timm, multi-scale detection, facial-expression recognition, faster-whisper, Spark-TTS, librosa, N-gram language models</w:t>
+        <w:t xml:space="preserve">Machine Learning:</w:t>
+      </w:r>
+      <w:r>
+        <w:t xml:space="preserve"> </w:t>
+      </w:r>
+      <w:r>
+        <w:t xml:space="preserve">PyTorch, Transformers, CNNs, GANs, computer vision, NLP, retrieval-augmented generation (RAG), ONNX</w:t>
       </w:r>
     </w:p>
     <w:p>
@@ -170,35 +170,13 @@
           <w:b/>
           <w:bCs/>
         </w:rPr>
-        <w:t xml:space="preserve">Data / Backend:</w:t>
-      </w:r>
-      <w:r>
-        <w:t xml:space="preserve"> </w:t>
-      </w:r>
-      <w:r>
-        <w:t xml:space="preserve">FastAPI, WebSockets, async Python, Playwright, SQL Server (pyodbc), Postgres (Neon) + pgvector, SQLAlchemy, pandas, NumPy</w:t>
-      </w:r>
-    </w:p>
-    <w:p>
-      <w:pPr>
-        <w:pStyle w:val="Compact"/>
-        <w:numPr>
-          <w:ilvl w:val="0"/>
-          <w:numId w:val="1001"/>
-        </w:numPr>
-      </w:pPr>
-      <w:r>
-        <w:rPr>
-          <w:b/>
-          <w:bCs/>
-        </w:rPr>
-        <w:t xml:space="preserve">Deployment / Tools:</w:t>
-      </w:r>
-      <w:r>
-        <w:t xml:space="preserve"> </w:t>
-      </w:r>
-      <w:r>
-        <w:t xml:space="preserve">ONNX Runtime, Unity Barracuda/Sentis, CUDA 12, Vercel, Docker, Git, Linux/WSL, React, Vite</w:t>
+        <w:t xml:space="preserve">Frontend &amp; Tools:</w:t>
+      </w:r>
+      <w:r>
+        <w:t xml:space="preserve"> </w:t>
+      </w:r>
+      <w:r>
+        <w:t xml:space="preserve">React, Vite, Git, Docker, Linux/WSL, Vercel, CUDA</w:t>
       </w:r>
     </w:p>
     <w:bookmarkEnd w:id="13"/>
@@ -238,7 +216,7 @@
         </w:numPr>
       </w:pPr>
       <w:r>
-        <w:t xml:space="preserve">Lead engineer for the customer-support agent platform — a multi-channel (web, WhatsApp, Slack) FastAPI app on Neon Postgres + pgvector, deployed on Vercel and live on infigosolutions.com.</w:t>
+        <w:t xml:space="preserve">Lead developer of the company’s customer-support assistant, a multi-channel application (website, WhatsApp, and Slack) built with FastAPI and PostgreSQL and deployed on Vercel, now running live on infigosolutions.com.</w:t>
       </w:r>
     </w:p>
     <w:p>
@@ -250,7 +228,7 @@
         </w:numPr>
       </w:pPr>
       <w:r>
-        <w:t xml:space="preserve">Built a hybrid RAG pipeline (chunking, embeddings, cosine + Postgres FTS search, ERP context joins) with cost/safety guardrails on Groq Llama-3.1-8B: answer caching, budget tracker, and retrieval/output caps.</w:t>
+        <w:t xml:space="preserve">Designed the system that answers customer questions from the company knowledge base and ERP records, including caching, usage limits, and safeguards to keep running costs low and responses accurate.</w:t>
       </w:r>
     </w:p>
     <w:p>
@@ -262,7 +240,7 @@
         </w:numPr>
       </w:pPr>
       <w:r>
-        <w:t xml:space="preserve">Shipped an embeddable React chat widget and public chat API; authored the Postgres migration suite, synthetic ERP seeder, and smoke-test harness.</w:t>
+        <w:t xml:space="preserve">Built an embeddable chat widget and public API for the website, and wrote the database migrations, seed data, and tests used across releases.</w:t>
       </w:r>
     </w:p>
     <w:p>
@@ -292,11 +270,35 @@
         </w:numPr>
       </w:pPr>
       <w:r>
-        <w:t xml:space="preserve">Built the first Infigobot prototype (FastAPI + Groq LLM + curated KB), the Vercel deployment, and the site-key auth flow used in production; promoted to full-time based on this work.</w:t>
+        <w:t xml:space="preserve">Built a web-scraping pipeline (Clutch, Wellfound) that collected company and contact information at scale and loaded it into a normalized SQL Server database used by the sales team for lead generation.</w:t>
+      </w:r>
+    </w:p>
+    <w:p>
+      <w:pPr>
+        <w:pStyle w:val="Compact"/>
+        <w:numPr>
+          <w:ilvl w:val="0"/>
+          <w:numId w:val="1003"/>
+        </w:numPr>
+      </w:pPr>
+      <w:r>
+        <w:t xml:space="preserve">Added anti-bot handling and resumable progress tracking to keep long scraping runs reliable, plus regex-based extraction of emails, phone numbers, and LinkedIn profiles.</w:t>
+      </w:r>
+    </w:p>
+    <w:p>
+      <w:pPr>
+        <w:pStyle w:val="Compact"/>
+        <w:numPr>
+          <w:ilvl w:val="0"/>
+          <w:numId w:val="1003"/>
+        </w:numPr>
+      </w:pPr>
+      <w:r>
+        <w:t xml:space="preserve">Developed the first prototype of the support chatbot and set up its initial deployment and authentication, which led to a full-time offer.</w:t>
       </w:r>
     </w:p>
     <w:bookmarkEnd w:id="14"/>
-    <w:bookmarkStart w:id="23" w:name="projects"/>
+    <w:bookmarkStart w:id="22" w:name="projects"/>
     <w:p>
       <w:pPr>
         <w:pStyle w:val="Heading2"/>
@@ -343,7 +345,7 @@
         </w:numPr>
       </w:pPr>
       <w:r>
-        <w:t xml:space="preserve">Trained facial-expression recognition across 7 datasets (DFEW, FER2013, RAF-DB, CK+, Aff-Wild2, etc.) mapped to a 4-class stress schema feeding a unified video + audio + heart-rate classifier consumed by a Unity game.</w:t>
+        <w:t xml:space="preserve">Trained facial-expression recognition models on several public datasets and combined video, audio, and heart-rate signals into a single stress classifier that drives a Unity game.</w:t>
       </w:r>
     </w:p>
     <w:p>
@@ -355,17 +357,7 @@
         </w:numPr>
       </w:pPr>
       <w:r>
-        <w:t xml:space="preserve">Built a stress-conditioned Fusion Generator (~500K-param MLP), a conditional WaveGAN for horror audio, and a U-Net for PBR texture corruption — all exported to ONNX for Unity Barracuda/Sentis.</w:t>
-      </w:r>
-      <w:r>
-        <w:t xml:space="preserve"> </w:t>
-      </w:r>
-      <w:r>
-        <w:rPr>
-          <w:i/>
-          <w:iCs/>
-        </w:rPr>
-        <w:t xml:space="preserve">(PyTorch, ONNX, OpenCV, Unity)</w:t>
+        <w:t xml:space="preserve">Built generative models (a parameter generator, an audio GAN, and a texture network) that adapt the game’s sound and visuals to player stress in real time, exported to ONNX for use in Unity.</w:t>
       </w:r>
     </w:p>
     <w:p>
@@ -377,7 +369,7 @@
           <w:b/>
           <w:bCs/>
         </w:rPr>
-        <w:t xml:space="preserve">Lead-Generation Scraping Engine &amp; SQL Data Bank</w:t>
+        <w:t xml:space="preserve">Voice-Cloning Conversational Agent</w:t>
       </w:r>
       <w:r>
         <w:t xml:space="preserve"> </w:t>
@@ -406,7 +398,7 @@
         </w:numPr>
       </w:pPr>
       <w:r>
-        <w:t xml:space="preserve">Built an async Playwright scraping suite (Clutch, Wellfound) with custom anti-bot stealth patches to extract company profiles, reviews, and contact details at scale, with regex email/phone/LinkedIn enrichment.</w:t>
+        <w:t xml:space="preserve">Built a real-time voice chat system that transcribes speech, generates replies with a language model, and responds in a cloned voice, running locally on a single 16 GB GPU.</w:t>
       </w:r>
     </w:p>
     <w:p>
@@ -418,17 +410,7 @@
         </w:numPr>
       </w:pPr>
       <w:r>
-        <w:t xml:space="preserve">Designed a normalized SQL Server schema (Source → Organizations → Contacts → Reviews) with deduplication, foreign-key reconciliation, and incremental sync.</w:t>
-      </w:r>
-      <w:r>
-        <w:t xml:space="preserve"> </w:t>
-      </w:r>
-      <w:r>
-        <w:rPr>
-          <w:i/>
-          <w:iCs/>
-        </w:rPr>
-        <w:t xml:space="preserve">(Python, Playwright, SQL Server/pyodbc, pandas)</w:t>
+        <w:t xml:space="preserve">FastAPI backend with WebSocket streaming and a React frontend for voice upload and live playback.</w:t>
       </w:r>
     </w:p>
     <w:p>
@@ -440,7 +422,7 @@
           <w:b/>
           <w:bCs/>
         </w:rPr>
-        <w:t xml:space="preserve">Local Voice-Cloning Conversational Agent</w:t>
+        <w:t xml:space="preserve">Hybrid Wildlife Detection</w:t>
       </w:r>
       <w:r>
         <w:t xml:space="preserve"> </w:t>
@@ -469,17 +451,7 @@
         </w:numPr>
       </w:pPr>
       <w:r>
-        <w:t xml:space="preserve">End-to-end voice pipeline (faster-whisper STT → Groq Llama-3.1-8B → Spark-TTS cloned voice) in 16 GB VRAM; FastAPI + WebSockets backend and React/Vite SPA with consent-gated voice upload.</w:t>
-      </w:r>
-      <w:r>
-        <w:t xml:space="preserve"> </w:t>
-      </w:r>
-      <w:r>
-        <w:rPr>
-          <w:i/>
-          <w:iCs/>
-        </w:rPr>
-        <w:t xml:space="preserve">(FastAPI, PyTorch, Spark-TTS, React)</w:t>
+        <w:t xml:space="preserve">Built a compact image detector that classifies animals and locates them in camera-trap photos across 21 species, combining techniques from three recent research papers and tuned to run on a 6 GB GPU.</w:t>
       </w:r>
     </w:p>
     <w:p>
@@ -491,7 +463,7 @@
           <w:b/>
           <w:bCs/>
         </w:rPr>
-        <w:t xml:space="preserve">Hybrid Wildlife Detection</w:t>
+        <w:t xml:space="preserve">Transformer and RAG from Scratch</w:t>
       </w:r>
       <w:r>
         <w:t xml:space="preserve"> </w:t>
@@ -520,17 +492,7 @@
         </w:numPr>
       </w:pPr>
       <w:r>
-        <w:t xml:space="preserve">4.5M-param detector synthesizing 3 research papers: EfficientNet-B0 multi-scale fusion + spatial attention + 3 task heads (classification, bbox, objectness), trained on Missouri Camera Traps tuned for a 6 GB GPU.</w:t>
-      </w:r>
-      <w:r>
-        <w:t xml:space="preserve"> </w:t>
-      </w:r>
-      <w:r>
-        <w:rPr>
-          <w:i/>
-          <w:iCs/>
-        </w:rPr>
-        <w:t xml:space="preserve">(PyTorch, timm, albumentations)</w:t>
+        <w:t xml:space="preserve">Implemented a Transformer encoder and decoder from scratch in PyTorch for review sentiment classification (82% accuracy) and explanation generation, with a retrieval step over similar examples.</w:t>
       </w:r>
     </w:p>
     <w:p>
@@ -542,13 +504,7 @@
           <w:b/>
           <w:bCs/>
         </w:rPr>
-        <w:t xml:space="preserve">From-Scratch Transformer + RAG (NLP)</w:t>
-      </w:r>
-      <w:r>
-        <w:t xml:space="preserve"> </w:t>
-      </w:r>
-      <w:r>
-        <w:t xml:space="preserve">|</w:t>
+        <w:t xml:space="preserve">Other:</w:t>
       </w:r>
       <w:r>
         <w:t xml:space="preserve"> </w:t>
@@ -558,42 +514,14 @@
           <w:rPr>
             <w:rStyle w:val="Hyperlink"/>
           </w:rPr>
-          <w:t xml:space="preserve">GitHub</w:t>
+          <w:t xml:space="preserve">Urdu text generator</w:t>
         </w:r>
       </w:hyperlink>
-    </w:p>
-    <w:p>
-      <w:pPr>
-        <w:pStyle w:val="Compact"/>
-        <w:numPr>
-          <w:ilvl w:val="0"/>
-          <w:numId w:val="1008"/>
-        </w:numPr>
-      </w:pPr>
-      <w:r>
-        <w:t xml:space="preserve">Built a multi-task Transformer encoder/decoder from scratch (82% sentiment accuracy) with retrieval-augmented explanation generation and perplexity analysis.</w:t>
-      </w:r>
-      <w:r>
-        <w:t xml:space="preserve"> </w:t>
-      </w:r>
-      <w:r>
-        <w:rPr>
-          <w:i/>
-          <w:iCs/>
-        </w:rPr>
-        <w:t xml:space="preserve">(PyTorch, NumPy)</w:t>
-      </w:r>
-    </w:p>
-    <w:p>
-      <w:pPr>
-        <w:pStyle w:val="FirstParagraph"/>
-      </w:pPr>
-      <w:r>
-        <w:rPr>
-          <w:b/>
-          <w:bCs/>
-        </w:rPr>
-        <w:t xml:space="preserve">Additional:</w:t>
+      <w:r>
+        <w:t xml:space="preserve"> </w:t>
+      </w:r>
+      <w:r>
+        <w:t xml:space="preserve">(statistical language models with a Streamlit app);</w:t>
       </w:r>
       <w:r>
         <w:t xml:space="preserve"> </w:t>
@@ -603,36 +531,19 @@
           <w:rPr>
             <w:rStyle w:val="Hyperlink"/>
           </w:rPr>
-          <w:t xml:space="preserve">BBC Urdu N-gram text generator</w:t>
+          <w:t xml:space="preserve">Sentinel trading bot</w:t>
         </w:r>
       </w:hyperlink>
       <w:r>
         <w:t xml:space="preserve"> </w:t>
       </w:r>
       <w:r>
-        <w:t xml:space="preserve">(Streamlit);</w:t>
+        <w:t xml:space="preserve">(automated Binance trading with sentiment signals);</w:t>
       </w:r>
       <w:r>
         <w:t xml:space="preserve"> </w:t>
       </w:r>
       <w:hyperlink r:id="rId21">
-        <w:r>
-          <w:rPr>
-            <w:rStyle w:val="Hyperlink"/>
-          </w:rPr>
-          <w:t xml:space="preserve">Sentinel adaptive trading bot</w:t>
-        </w:r>
-      </w:hyperlink>
-      <w:r>
-        <w:t xml:space="preserve"> </w:t>
-      </w:r>
-      <w:r>
-        <w:t xml:space="preserve">(Binance API, sentiment signals);</w:t>
-      </w:r>
-      <w:r>
-        <w:t xml:space="preserve"> </w:t>
-      </w:r>
-      <w:hyperlink r:id="rId22">
         <w:r>
           <w:rPr>
             <w:rStyle w:val="Hyperlink"/>
@@ -644,11 +555,11 @@
         <w:t xml:space="preserve"> </w:t>
       </w:r>
       <w:r>
-        <w:t xml:space="preserve">(React/Vite).</w:t>
-      </w:r>
-    </w:p>
-    <w:bookmarkEnd w:id="23"/>
-    <w:bookmarkStart w:id="24" w:name="education"/>
+        <w:t xml:space="preserve">(React).</w:t>
+      </w:r>
+    </w:p>
+    <w:bookmarkEnd w:id="22"/>
+    <w:bookmarkStart w:id="23" w:name="education"/>
     <w:p>
       <w:pPr>
         <w:pStyle w:val="Heading2"/>
@@ -678,7 +589,7 @@
         <w:t xml:space="preserve"> </w:t>
       </w:r>
       <w:r>
-        <w:t xml:space="preserve">Coursework: Deep Learning, NLP, Computer Vision, Generative AI, Databases, Software Engineering, DSA, Probability &amp; Statistics</w:t>
+        <w:t xml:space="preserve">Relevant coursework: Deep Learning, NLP, Computer Vision, Databases, Software Engineering, Data Structures &amp; Algorithms, Probability &amp; Statistics</w:t>
       </w:r>
     </w:p>
     <w:p>
@@ -715,8 +626,8 @@
         <w:t xml:space="preserve">| Beaconhouse | 2017 – 2020</w:t>
       </w:r>
     </w:p>
+    <w:bookmarkEnd w:id="23"/>
     <w:bookmarkEnd w:id="24"/>
-    <w:bookmarkEnd w:id="25"/>
     <w:sectPr>
       <w:footnotePr>
         <w:numRestart w:val="eachSect"/>
@@ -952,9 +863,6 @@
     <w:abstractNumId w:val="991"/>
   </w:num>
   <w:num w:numId="1007">
-    <w:abstractNumId w:val="991"/>
-  </w:num>
-  <w:num w:numId="1008">
     <w:abstractNumId w:val="991"/>
   </w:num>
 </w:numbering>

</xml_diff>

<commit_message>
Centered header + blue accent, AI/ML-tailored summary, detailed projects, fix SIP as restaurant app, fill page
Co-authored-by: Cursor <cursoragent@cursor.com>
</commit_message>
<xml_diff>
--- a/Sameer_Asif_Resume.docx
+++ b/Sameer_Asif_Resume.docx
@@ -2,7 +2,7 @@
 <file path=word/document.xml><?xml version="1.0" encoding="utf-8"?>
 <w:document xmlns:w="http://schemas.openxmlformats.org/wordprocessingml/2006/main" xmlns:m="http://schemas.openxmlformats.org/officeDocument/2006/math" xmlns:r="http://schemas.openxmlformats.org/officeDocument/2006/relationships" xmlns:o="urn:schemas-microsoft-com:office:office" xmlns:v="urn:schemas-microsoft-com:vml" xmlns:w10="urn:schemas-microsoft-com:office:word" xmlns:a="http://schemas.openxmlformats.org/drawingml/2006/main" xmlns:pic="http://schemas.openxmlformats.org/drawingml/2006/picture" xmlns:wp="http://schemas.openxmlformats.org/drawingml/2006/wordprocessingDrawing">
   <w:body>
-    <w:bookmarkStart w:id="24" w:name="sameer-asif"/>
+    <w:bookmarkStart w:id="33" w:name="sameer-asif"/>
     <w:p>
       <w:pPr>
         <w:pStyle w:val="Heading1"/>
@@ -14,6 +14,14 @@
     <w:p>
       <w:pPr>
         <w:pStyle w:val="FirstParagraph"/>
+      </w:pPr>
+      <w:r>
+        <w:t xml:space="preserve">AI / ML Engineer | LLMs · Computer Vision · Generative AI · Backend</w:t>
+      </w:r>
+    </w:p>
+    <w:p>
+      <w:pPr>
+        <w:pStyle w:val="BodyText"/>
       </w:pPr>
       <w:r>
         <w:t xml:space="preserve">Islamabad, Pakistan | +92 323 5151542 |</w:t>
@@ -78,7 +86,7 @@
         <w:pStyle w:val="FirstParagraph"/>
       </w:pPr>
       <w:r>
-        <w:t xml:space="preserve">Software and AI engineer and final-year BS Artificial Intelligence student at FAST-NUCES, currently building and maintaining production systems at Infigo Solutions. Comfortable across the full stack, from data pipelines and web scraping to backend APIs, databases, and machine learning models, with a focus on shipping work from prototype to deployment.</w:t>
+        <w:t xml:space="preserve">AI/ML engineer and final-year BS Artificial Intelligence student at FAST-NUCES, currently building production machine-learning systems at Infigo Solutions. I work end-to-end across the ML lifecycle: data collection and pipelines, model architecture and training in PyTorch, and deployment behind FastAPI services and vector databases. My experience spans large language models and retrieval-augmented generation, computer vision, generative models such as GANs and U-Nets, and speech processing, with a track record of taking research ideas and prototypes through to deployed, real-time systems.</w:t>
       </w:r>
     </w:p>
     <w:bookmarkEnd w:id="12"/>
@@ -126,13 +134,13 @@
           <w:b/>
           <w:bCs/>
         </w:rPr>
-        <w:t xml:space="preserve">Backend &amp; Data:</w:t>
+        <w:t xml:space="preserve">Machine Learning:</w:t>
       </w:r>
       <w:r>
         <w:t xml:space="preserve"> </w:t>
       </w:r>
       <w:r>
-        <w:t xml:space="preserve">FastAPI, REST APIs, WebSockets, async Python, Playwright, SQL Server, PostgreSQL, SQLAlchemy, pandas, NumPy</w:t>
+        <w:t xml:space="preserve">PyTorch, Hugging Face Transformers, CNNs, GANs, U-Net, EfficientNet, multi-task learning, self-attention, ONNX</w:t>
       </w:r>
     </w:p>
     <w:p>
@@ -148,13 +156,57 @@
           <w:b/>
           <w:bCs/>
         </w:rPr>
-        <w:t xml:space="preserve">Machine Learning:</w:t>
+        <w:t xml:space="preserve">LLMs &amp; NLP:</w:t>
       </w:r>
       <w:r>
         <w:t xml:space="preserve"> </w:t>
       </w:r>
       <w:r>
-        <w:t xml:space="preserve">PyTorch, Transformers, CNNs, GANs, computer vision, NLP, retrieval-augmented generation (RAG), ONNX</w:t>
+        <w:t xml:space="preserve">retrieval-augmented generation (RAG), pgvector, embeddings, semantic search, prompt engineering, LoRA/SFT, language modeling</w:t>
+      </w:r>
+    </w:p>
+    <w:p>
+      <w:pPr>
+        <w:pStyle w:val="Compact"/>
+        <w:numPr>
+          <w:ilvl w:val="0"/>
+          <w:numId w:val="1001"/>
+        </w:numPr>
+      </w:pPr>
+      <w:r>
+        <w:rPr>
+          <w:b/>
+          <w:bCs/>
+        </w:rPr>
+        <w:t xml:space="preserve">Computer Vision &amp; Speech:</w:t>
+      </w:r>
+      <w:r>
+        <w:t xml:space="preserve"> </w:t>
+      </w:r>
+      <w:r>
+        <w:t xml:space="preserve">OpenCV, timm, object detection, facial-expression recognition, faster-whisper (STT), Spark-TTS, librosa</w:t>
+      </w:r>
+    </w:p>
+    <w:p>
+      <w:pPr>
+        <w:pStyle w:val="Compact"/>
+        <w:numPr>
+          <w:ilvl w:val="0"/>
+          <w:numId w:val="1001"/>
+        </w:numPr>
+      </w:pPr>
+      <w:r>
+        <w:rPr>
+          <w:b/>
+          <w:bCs/>
+        </w:rPr>
+        <w:t xml:space="preserve">Backend &amp; Data:</w:t>
+      </w:r>
+      <w:r>
+        <w:t xml:space="preserve"> </w:t>
+      </w:r>
+      <w:r>
+        <w:t xml:space="preserve">FastAPI, REST APIs, WebSockets, async Python, Playwright, SQL Server, PostgreSQL/pgvector, SQLAlchemy, pandas, NumPy</w:t>
       </w:r>
     </w:p>
     <w:p>
@@ -180,7 +232,7 @@
       </w:r>
     </w:p>
     <w:bookmarkEnd w:id="13"/>
-    <w:bookmarkStart w:id="14" w:name="experience"/>
+    <w:bookmarkStart w:id="16" w:name="experience"/>
     <w:p>
       <w:pPr>
         <w:pStyle w:val="Heading2"/>
@@ -189,22 +241,21 @@
         <w:t xml:space="preserve">EXPERIENCE</w:t>
       </w:r>
     </w:p>
+    <w:bookmarkStart w:id="14" w:name="junior-ai-engineer"/>
+    <w:p>
+      <w:pPr>
+        <w:pStyle w:val="Heading3"/>
+      </w:pPr>
+      <w:r>
+        <w:t xml:space="preserve">Junior AI Engineer</w:t>
+      </w:r>
+    </w:p>
     <w:p>
       <w:pPr>
         <w:pStyle w:val="FirstParagraph"/>
       </w:pPr>
       <w:r>
-        <w:rPr>
-          <w:b/>
-          <w:bCs/>
-        </w:rPr>
-        <w:t xml:space="preserve">Junior AI Engineer</w:t>
-      </w:r>
-      <w:r>
-        <w:t xml:space="preserve"> </w:t>
-      </w:r>
-      <w:r>
-        <w:t xml:space="preserve">| Infigo Solutions, Islamabad | July 2025 – Present</w:t>
+        <w:t xml:space="preserve">Infigo Solutions, Islamabad | July 2025 – Present</w:t>
       </w:r>
     </w:p>
     <w:p>
@@ -216,7 +267,7 @@
         </w:numPr>
       </w:pPr>
       <w:r>
-        <w:t xml:space="preserve">Lead developer of the company’s customer-support assistant, a multi-channel application (website, WhatsApp, and Slack) built with FastAPI and PostgreSQL and deployed on Vercel, now running live on infigosolutions.com.</w:t>
+        <w:t xml:space="preserve">Lead developer of the company’s AI customer-support assistant, a multi-channel application (website, WhatsApp, and Slack) built with FastAPI and PostgreSQL (pgvector) and deployed on Vercel, now running live on infigosolutions.com.</w:t>
       </w:r>
     </w:p>
     <w:p>
@@ -228,7 +279,7 @@
         </w:numPr>
       </w:pPr>
       <w:r>
-        <w:t xml:space="preserve">Designed the system that answers customer questions from the company knowledge base and ERP records, including caching, usage limits, and safeguards to keep running costs low and responses accurate.</w:t>
+        <w:t xml:space="preserve">Designed and built a retrieval-augmented generation (RAG) pipeline: document chunking, embeddings stored in pgvector, cosine top-k search with a full-text-search fallback, and ERP context (customers, orders, invoices) injected into model prompts.</w:t>
       </w:r>
     </w:p>
     <w:p>
@@ -240,7 +291,29 @@
         </w:numPr>
       </w:pPr>
       <w:r>
-        <w:t xml:space="preserve">Built an embeddable chat widget and public API for the website, and wrote the database migrations, seed data, and tests used across releases.</w:t>
+        <w:t xml:space="preserve">Added cost and safety controls around a Groq-hosted Llama 3.1 8B model, including answer caching, token-budget tracking, retrieval limits, and escalation rules, to keep responses accurate and within budget.</w:t>
+      </w:r>
+    </w:p>
+    <w:p>
+      <w:pPr>
+        <w:pStyle w:val="Compact"/>
+        <w:numPr>
+          <w:ilvl w:val="0"/>
+          <w:numId w:val="1002"/>
+        </w:numPr>
+      </w:pPr>
+      <w:r>
+        <w:t xml:space="preserve">Built an embeddable React chat widget and a public chat API, and authored the database migrations, synthetic seed data, and smoke tests used across releases.</w:t>
+      </w:r>
+    </w:p>
+    <w:bookmarkEnd w:id="14"/>
+    <w:bookmarkStart w:id="15" w:name="ai-engineering-intern"/>
+    <w:p>
+      <w:pPr>
+        <w:pStyle w:val="Heading3"/>
+      </w:pPr>
+      <w:r>
+        <w:t xml:space="preserve">AI Engineering Intern</w:t>
       </w:r>
     </w:p>
     <w:p>
@@ -248,17 +321,7 @@
         <w:pStyle w:val="FirstParagraph"/>
       </w:pPr>
       <w:r>
-        <w:rPr>
-          <w:b/>
-          <w:bCs/>
-        </w:rPr>
-        <w:t xml:space="preserve">AI Engineering Intern</w:t>
-      </w:r>
-      <w:r>
-        <w:t xml:space="preserve"> </w:t>
-      </w:r>
-      <w:r>
-        <w:t xml:space="preserve">| Infigo Solutions, Islamabad | June 2025 – July 2025</w:t>
+        <w:t xml:space="preserve">Infigo Solutions, Islamabad | June 2025 – July 2025</w:t>
       </w:r>
     </w:p>
     <w:p>
@@ -270,7 +333,7 @@
         </w:numPr>
       </w:pPr>
       <w:r>
-        <w:t xml:space="preserve">Built a web-scraping pipeline (Clutch, Wellfound) that collected company and contact information at scale and loaded it into a normalized SQL Server database used by the sales team for lead generation.</w:t>
+        <w:t xml:space="preserve">Built an asynchronous web-scraping pipeline (Clutch, Wellfound) that collected company and contact data at scale and loaded it into a normalized SQL Server database used by the sales team for lead generation.</w:t>
       </w:r>
     </w:p>
     <w:p>
@@ -282,7 +345,7 @@
         </w:numPr>
       </w:pPr>
       <w:r>
-        <w:t xml:space="preserve">Added anti-bot handling and resumable progress tracking to keep long scraping runs reliable, plus regex-based extraction of emails, phone numbers, and LinkedIn profiles.</w:t>
+        <w:t xml:space="preserve">Added anti-bot handling, resumable progress tracking, and regex-based extraction of emails, phone numbers, and LinkedIn profiles to keep long scraping runs reliable.</w:t>
       </w:r>
     </w:p>
     <w:p>
@@ -294,11 +357,12 @@
         </w:numPr>
       </w:pPr>
       <w:r>
-        <w:t xml:space="preserve">Developed the first prototype of the support chatbot and set up its initial deployment and authentication, which led to a full-time offer.</w:t>
-      </w:r>
-    </w:p>
-    <w:bookmarkEnd w:id="14"/>
-    <w:bookmarkStart w:id="22" w:name="projects"/>
+        <w:t xml:space="preserve">Developed the first prototype of the support chatbot with its initial deployment and authentication flow, which led to a full-time offer.</w:t>
+      </w:r>
+    </w:p>
+    <w:bookmarkEnd w:id="15"/>
+    <w:bookmarkEnd w:id="16"/>
+    <w:bookmarkStart w:id="29" w:name="projects"/>
     <w:p>
       <w:pPr>
         <w:pStyle w:val="Heading2"/>
@@ -307,132 +371,19 @@
         <w:t xml:space="preserve">PROJECTS</w:t>
       </w:r>
     </w:p>
+    <w:bookmarkStart w:id="18" w:name="X6117e55b9e8c6f977468d896cc5646525e37580"/>
+    <w:p>
+      <w:pPr>
+        <w:pStyle w:val="Heading3"/>
+      </w:pPr>
+      <w:r>
+        <w:t xml:space="preserve">Adaptive Psychological Horror Game — Final Year Project</w:t>
+      </w:r>
+    </w:p>
     <w:p>
       <w:pPr>
         <w:pStyle w:val="FirstParagraph"/>
       </w:pPr>
-      <w:r>
-        <w:rPr>
-          <w:b/>
-          <w:bCs/>
-        </w:rPr>
-        <w:t xml:space="preserve">Adaptive Psychological Horror Game — Final Year Project</w:t>
-      </w:r>
-      <w:r>
-        <w:t xml:space="preserve"> </w:t>
-      </w:r>
-      <w:r>
-        <w:t xml:space="preserve">|</w:t>
-      </w:r>
-      <w:r>
-        <w:t xml:space="preserve"> </w:t>
-      </w:r>
-      <w:hyperlink r:id="rId15">
-        <w:r>
-          <w:rPr>
-            <w:rStyle w:val="Hyperlink"/>
-          </w:rPr>
-          <w:t xml:space="preserve">GitHub</w:t>
-        </w:r>
-      </w:hyperlink>
-    </w:p>
-    <w:p>
-      <w:pPr>
-        <w:pStyle w:val="Compact"/>
-        <w:numPr>
-          <w:ilvl w:val="0"/>
-          <w:numId w:val="1004"/>
-        </w:numPr>
-      </w:pPr>
-      <w:r>
-        <w:t xml:space="preserve">Trained facial-expression recognition models on several public datasets and combined video, audio, and heart-rate signals into a single stress classifier that drives a Unity game.</w:t>
-      </w:r>
-    </w:p>
-    <w:p>
-      <w:pPr>
-        <w:pStyle w:val="Compact"/>
-        <w:numPr>
-          <w:ilvl w:val="0"/>
-          <w:numId w:val="1004"/>
-        </w:numPr>
-      </w:pPr>
-      <w:r>
-        <w:t xml:space="preserve">Built generative models (a parameter generator, an audio GAN, and a texture network) that adapt the game’s sound and visuals to player stress in real time, exported to ONNX for use in Unity.</w:t>
-      </w:r>
-    </w:p>
-    <w:p>
-      <w:pPr>
-        <w:pStyle w:val="FirstParagraph"/>
-      </w:pPr>
-      <w:r>
-        <w:rPr>
-          <w:b/>
-          <w:bCs/>
-        </w:rPr>
-        <w:t xml:space="preserve">Voice-Cloning Conversational Agent</w:t>
-      </w:r>
-      <w:r>
-        <w:t xml:space="preserve"> </w:t>
-      </w:r>
-      <w:r>
-        <w:t xml:space="preserve">|</w:t>
-      </w:r>
-      <w:r>
-        <w:t xml:space="preserve"> </w:t>
-      </w:r>
-      <w:hyperlink r:id="rId16">
-        <w:r>
-          <w:rPr>
-            <w:rStyle w:val="Hyperlink"/>
-          </w:rPr>
-          <w:t xml:space="preserve">GitHub</w:t>
-        </w:r>
-      </w:hyperlink>
-    </w:p>
-    <w:p>
-      <w:pPr>
-        <w:pStyle w:val="Compact"/>
-        <w:numPr>
-          <w:ilvl w:val="0"/>
-          <w:numId w:val="1005"/>
-        </w:numPr>
-      </w:pPr>
-      <w:r>
-        <w:t xml:space="preserve">Built a real-time voice chat system that transcribes speech, generates replies with a language model, and responds in a cloned voice, running locally on a single 16 GB GPU.</w:t>
-      </w:r>
-    </w:p>
-    <w:p>
-      <w:pPr>
-        <w:pStyle w:val="Compact"/>
-        <w:numPr>
-          <w:ilvl w:val="0"/>
-          <w:numId w:val="1005"/>
-        </w:numPr>
-      </w:pPr>
-      <w:r>
-        <w:t xml:space="preserve">FastAPI backend with WebSocket streaming and a React frontend for voice upload and live playback.</w:t>
-      </w:r>
-    </w:p>
-    <w:p>
-      <w:pPr>
-        <w:pStyle w:val="FirstParagraph"/>
-      </w:pPr>
-      <w:r>
-        <w:rPr>
-          <w:b/>
-          <w:bCs/>
-        </w:rPr>
-        <w:t xml:space="preserve">Hybrid Wildlife Detection</w:t>
-      </w:r>
-      <w:r>
-        <w:t xml:space="preserve"> </w:t>
-      </w:r>
-      <w:r>
-        <w:t xml:space="preserve">|</w:t>
-      </w:r>
-      <w:r>
-        <w:t xml:space="preserve"> </w:t>
-      </w:r>
       <w:hyperlink r:id="rId17">
         <w:r>
           <w:rPr>
@@ -441,40 +392,64 @@
           <w:t xml:space="preserve">GitHub</w:t>
         </w:r>
       </w:hyperlink>
-    </w:p>
-    <w:p>
-      <w:pPr>
-        <w:pStyle w:val="Compact"/>
-        <w:numPr>
-          <w:ilvl w:val="0"/>
-          <w:numId w:val="1006"/>
-        </w:numPr>
-      </w:pPr>
-      <w:r>
-        <w:t xml:space="preserve">Built a compact image detector that classifies animals and locates them in camera-trap photos across 21 species, combining techniques from three recent research papers and tuned to run on a 6 GB GPU.</w:t>
+      <w:r>
+        <w:t xml:space="preserve"> </w:t>
+      </w:r>
+      <w:r>
+        <w:t xml:space="preserve">· PyTorch, ONNX, Hugging Face, Unity</w:t>
+      </w:r>
+    </w:p>
+    <w:p>
+      <w:pPr>
+        <w:pStyle w:val="Compact"/>
+        <w:numPr>
+          <w:ilvl w:val="0"/>
+          <w:numId w:val="1004"/>
+        </w:numPr>
+      </w:pPr>
+      <w:r>
+        <w:t xml:space="preserve">Trained facial-expression recognition models across seven public datasets (DFEW, FERV39k, FER2013, RAF-DB, CK+, Aff-Wild2, RAVDESS) and mapped them to a four-class stress schema, fusing video, audio, and heart-rate signals into a single real-time stress classifier consumed by a Unity game.</w:t>
+      </w:r>
+    </w:p>
+    <w:p>
+      <w:pPr>
+        <w:pStyle w:val="Compact"/>
+        <w:numPr>
+          <w:ilvl w:val="0"/>
+          <w:numId w:val="1004"/>
+        </w:numPr>
+      </w:pPr>
+      <w:r>
+        <w:t xml:space="preserve">Designed a stress-conditioned Fusion Generator (a ~500K-parameter MLP with sub-millisecond GPU inference) that outputs 30 parameters driving the game’s audio, DSP, lighting, camera, and entity behaviour.</w:t>
+      </w:r>
+    </w:p>
+    <w:p>
+      <w:pPr>
+        <w:pStyle w:val="Compact"/>
+        <w:numPr>
+          <w:ilvl w:val="0"/>
+          <w:numId w:val="1004"/>
+        </w:numPr>
+      </w:pPr>
+      <w:r>
+        <w:t xml:space="preserve">Trained a conditional WaveGAN (~2M parameters) for procedural horror audio and a conditional U-Net (~3M parameters, 256×256) for real-time PBR texture corruption, exporting every model to ONNX for Unity Barracuda/Sentis.</w:t>
+      </w:r>
+    </w:p>
+    <w:bookmarkEnd w:id="18"/>
+    <w:bookmarkStart w:id="20" w:name="voice-cloning-conversational-agent"/>
+    <w:p>
+      <w:pPr>
+        <w:pStyle w:val="Heading3"/>
+      </w:pPr>
+      <w:r>
+        <w:t xml:space="preserve">Voice-Cloning Conversational Agent</w:t>
       </w:r>
     </w:p>
     <w:p>
       <w:pPr>
         <w:pStyle w:val="FirstParagraph"/>
       </w:pPr>
-      <w:r>
-        <w:rPr>
-          <w:b/>
-          <w:bCs/>
-        </w:rPr>
-        <w:t xml:space="preserve">Transformer and RAG from Scratch</w:t>
-      </w:r>
-      <w:r>
-        <w:t xml:space="preserve"> </w:t>
-      </w:r>
-      <w:r>
-        <w:t xml:space="preserve">|</w:t>
-      </w:r>
-      <w:r>
-        <w:t xml:space="preserve"> </w:t>
-      </w:r>
-      <w:hyperlink r:id="rId18">
+      <w:hyperlink r:id="rId19">
         <w:r>
           <w:rPr>
             <w:rStyle w:val="Hyperlink"/>
@@ -482,152 +457,306 @@
           <w:t xml:space="preserve">GitHub</w:t>
         </w:r>
       </w:hyperlink>
-    </w:p>
-    <w:p>
-      <w:pPr>
-        <w:pStyle w:val="Compact"/>
-        <w:numPr>
-          <w:ilvl w:val="0"/>
-          <w:numId w:val="1007"/>
-        </w:numPr>
-      </w:pPr>
-      <w:r>
-        <w:t xml:space="preserve">Implemented a Transformer encoder and decoder from scratch in PyTorch for review sentiment classification (82% accuracy) and explanation generation, with a retrieval step over similar examples.</w:t>
+      <w:r>
+        <w:t xml:space="preserve"> </w:t>
+      </w:r>
+      <w:r>
+        <w:t xml:space="preserve">· FastAPI, PyTorch, faster-whisper, Spark-TTS, React</w:t>
+      </w:r>
+    </w:p>
+    <w:p>
+      <w:pPr>
+        <w:pStyle w:val="Compact"/>
+        <w:numPr>
+          <w:ilvl w:val="0"/>
+          <w:numId w:val="1005"/>
+        </w:numPr>
+      </w:pPr>
+      <w:r>
+        <w:t xml:space="preserve">Built an end-to-end real-time voice assistant: faster-whisper speech-to-text on CUDA, a Groq-hosted Llama 3.1 8B model for responses, and Spark-TTS cloned-voice synthesis, all fitting within 16 GB of VRAM through warmup and on-demand model unloading.</w:t>
+      </w:r>
+    </w:p>
+    <w:p>
+      <w:pPr>
+        <w:pStyle w:val="Compact"/>
+        <w:numPr>
+          <w:ilvl w:val="0"/>
+          <w:numId w:val="1005"/>
+        </w:numPr>
+      </w:pPr>
+      <w:r>
+        <w:t xml:space="preserve">Developed a FastAPI backend with WebSocket audio streaming and a voice-registry REST API, plus a React/Vite frontend with consent-gated voice upload, automatic transcription, and live playback.</w:t>
+      </w:r>
+    </w:p>
+    <w:bookmarkEnd w:id="20"/>
+    <w:bookmarkStart w:id="22" w:name="hybrid-wildlife-detection"/>
+    <w:p>
+      <w:pPr>
+        <w:pStyle w:val="Heading3"/>
+      </w:pPr>
+      <w:r>
+        <w:t xml:space="preserve">Hybrid Wildlife Detection</w:t>
       </w:r>
     </w:p>
     <w:p>
       <w:pPr>
         <w:pStyle w:val="FirstParagraph"/>
       </w:pPr>
-      <w:r>
-        <w:rPr>
-          <w:b/>
-          <w:bCs/>
-        </w:rPr>
-        <w:t xml:space="preserve">Other:</w:t>
-      </w:r>
-      <w:r>
-        <w:t xml:space="preserve"> </w:t>
-      </w:r>
-      <w:hyperlink r:id="rId19">
-        <w:r>
-          <w:rPr>
-            <w:rStyle w:val="Hyperlink"/>
-          </w:rPr>
-          <w:t xml:space="preserve">Urdu text generator</w:t>
-        </w:r>
-      </w:hyperlink>
-      <w:r>
-        <w:t xml:space="preserve"> </w:t>
-      </w:r>
-      <w:r>
-        <w:t xml:space="preserve">(statistical language models with a Streamlit app);</w:t>
-      </w:r>
-      <w:r>
-        <w:t xml:space="preserve"> </w:t>
-      </w:r>
-      <w:hyperlink r:id="rId20">
-        <w:r>
-          <w:rPr>
-            <w:rStyle w:val="Hyperlink"/>
-          </w:rPr>
-          <w:t xml:space="preserve">Sentinel trading bot</w:t>
-        </w:r>
-      </w:hyperlink>
-      <w:r>
-        <w:t xml:space="preserve"> </w:t>
-      </w:r>
-      <w:r>
-        <w:t xml:space="preserve">(automated Binance trading with sentiment signals);</w:t>
-      </w:r>
-      <w:r>
-        <w:t xml:space="preserve"> </w:t>
-      </w:r>
       <w:hyperlink r:id="rId21">
         <w:r>
           <w:rPr>
             <w:rStyle w:val="Hyperlink"/>
           </w:rPr>
-          <w:t xml:space="preserve">SIP investment calculator</w:t>
+          <w:t xml:space="preserve">GitHub</w:t>
         </w:r>
       </w:hyperlink>
       <w:r>
         <w:t xml:space="preserve"> </w:t>
       </w:r>
       <w:r>
-        <w:t xml:space="preserve">(React).</w:t>
+        <w:t xml:space="preserve">· PyTorch, timm, albumentations, OpenCV</w:t>
+      </w:r>
+    </w:p>
+    <w:p>
+      <w:pPr>
+        <w:pStyle w:val="Compact"/>
+        <w:numPr>
+          <w:ilvl w:val="0"/>
+          <w:numId w:val="1006"/>
+        </w:numPr>
+      </w:pPr>
+      <w:r>
+        <w:t xml:space="preserve">Built a 4.5M-parameter detector combining techniques from three recent research papers: an EfficientNet-B0 backbone with multi-scale feature fusion, spatial-attention gating, and three task heads for 21-class classification, bounding-box regression, and objectness scoring.</w:t>
+      </w:r>
+    </w:p>
+    <w:p>
+      <w:pPr>
+        <w:pStyle w:val="Compact"/>
+        <w:numPr>
+          <w:ilvl w:val="0"/>
+          <w:numId w:val="1006"/>
+        </w:numPr>
+      </w:pPr>
+      <w:r>
+        <w:t xml:space="preserve">Trained on the Missouri Camera Traps dataset with a stratified 70/15/15 split, an albumentations augmentation pipeline, gradient accumulation, OneCycle scheduling, and early stopping, tuned to fit a 6 GB GPU.</w:t>
       </w:r>
     </w:p>
     <w:bookmarkEnd w:id="22"/>
-    <w:bookmarkStart w:id="23" w:name="education"/>
-    <w:p>
-      <w:pPr>
-        <w:pStyle w:val="Heading2"/>
-      </w:pPr>
-      <w:r>
-        <w:t xml:space="preserve">EDUCATION</w:t>
+    <w:bookmarkStart w:id="24" w:name="transformer-and-rag-from-scratch"/>
+    <w:p>
+      <w:pPr>
+        <w:pStyle w:val="Heading3"/>
+      </w:pPr>
+      <w:r>
+        <w:t xml:space="preserve">Transformer and RAG from Scratch</w:t>
       </w:r>
     </w:p>
     <w:p>
       <w:pPr>
         <w:pStyle w:val="FirstParagraph"/>
       </w:pPr>
+      <w:hyperlink r:id="rId23">
+        <w:r>
+          <w:rPr>
+            <w:rStyle w:val="Hyperlink"/>
+          </w:rPr>
+          <w:t xml:space="preserve">GitHub</w:t>
+        </w:r>
+      </w:hyperlink>
+      <w:r>
+        <w:t xml:space="preserve"> </w:t>
+      </w:r>
+      <w:r>
+        <w:t xml:space="preserve">· PyTorch, NumPy</w:t>
+      </w:r>
+    </w:p>
+    <w:p>
+      <w:pPr>
+        <w:pStyle w:val="Compact"/>
+        <w:numPr>
+          <w:ilvl w:val="0"/>
+          <w:numId w:val="1007"/>
+        </w:numPr>
+      </w:pPr>
+      <w:r>
+        <w:t xml:space="preserve">Implemented a multi-task Transformer encoder from scratch in PyTorch for Amazon review understanding, reaching 82% sentiment accuracy and 99.7% derived-feature accuracy on a 7,497-sample test set.</w:t>
+      </w:r>
+    </w:p>
+    <w:p>
+      <w:pPr>
+        <w:pStyle w:val="Compact"/>
+        <w:numPr>
+          <w:ilvl w:val="0"/>
+          <w:numId w:val="1007"/>
+        </w:numPr>
+      </w:pPr>
+      <w:r>
+        <w:t xml:space="preserve">Built a Transformer decoder from scratch for explanation generation with retrieval-augmented context (top-3 cosine nearest neighbours) and analysed the retrieval versus no-retrieval perplexity trade-off.</w:t>
+      </w:r>
+    </w:p>
+    <w:bookmarkEnd w:id="24"/>
+    <w:bookmarkStart w:id="28" w:name="other-projects"/>
+    <w:p>
+      <w:pPr>
+        <w:pStyle w:val="Heading3"/>
+      </w:pPr>
+      <w:r>
+        <w:t xml:space="preserve">Other Projects</w:t>
+      </w:r>
+    </w:p>
+    <w:p>
+      <w:pPr>
+        <w:pStyle w:val="Compact"/>
+        <w:numPr>
+          <w:ilvl w:val="0"/>
+          <w:numId w:val="1008"/>
+        </w:numPr>
+      </w:pPr>
+      <w:hyperlink r:id="rId25">
+        <w:r>
+          <w:rPr>
+            <w:rStyle w:val="Hyperlink"/>
+            <w:b/>
+            <w:bCs/>
+          </w:rPr>
+          <w:t xml:space="preserve">SIP — Restaurant Ordering App</w:t>
+        </w:r>
+      </w:hyperlink>
       <w:r>
         <w:rPr>
           <w:b/>
           <w:bCs/>
         </w:rPr>
-        <w:t xml:space="preserve">BS Artificial Intelligence</w:t>
+        <w:t xml:space="preserve">:</w:t>
       </w:r>
       <w:r>
         <w:t xml:space="preserve"> </w:t>
       </w:r>
       <w:r>
-        <w:t xml:space="preserve">| FAST-NUCES, Islamabad | 2022 – 2026 (Expected)</w:t>
-      </w:r>
-      <w:r>
-        <w:t xml:space="preserve"> </w:t>
-      </w:r>
-      <w:r>
-        <w:t xml:space="preserve">Relevant coursework: Deep Learning, NLP, Computer Vision, Databases, Software Engineering, Data Structures &amp; Algorithms, Probability &amp; Statistics</w:t>
-      </w:r>
-    </w:p>
-    <w:p>
-      <w:pPr>
-        <w:pStyle w:val="BodyText"/>
-      </w:pPr>
+        <w:t xml:space="preserve">React/Vite web app for QR scan-to-order dining, with category-based menu browsing, cart, and a full checkout flow, deployed on Vercel.</w:t>
+      </w:r>
+    </w:p>
+    <w:p>
+      <w:pPr>
+        <w:pStyle w:val="Compact"/>
+        <w:numPr>
+          <w:ilvl w:val="0"/>
+          <w:numId w:val="1008"/>
+        </w:numPr>
+      </w:pPr>
+      <w:hyperlink r:id="rId26">
+        <w:r>
+          <w:rPr>
+            <w:rStyle w:val="Hyperlink"/>
+            <w:b/>
+            <w:bCs/>
+          </w:rPr>
+          <w:t xml:space="preserve">BBC Urdu Text Generator</w:t>
+        </w:r>
+      </w:hyperlink>
       <w:r>
         <w:rPr>
           <w:b/>
           <w:bCs/>
         </w:rPr>
-        <w:t xml:space="preserve">Cambridge A Levels</w:t>
+        <w:t xml:space="preserve">:</w:t>
       </w:r>
       <w:r>
         <w:t xml:space="preserve"> </w:t>
       </w:r>
       <w:r>
-        <w:t xml:space="preserve">| Beaconhouse School System | 2020 – 2022   |  </w:t>
-      </w:r>
-      <w:r>
-        <w:t xml:space="preserve"> </w:t>
-      </w:r>
+        <w:t xml:space="preserve">from-scratch n-gram language models with Laplace smoothing and a right-to-left Streamlit interface, evaluated with perplexity.</w:t>
+      </w:r>
+    </w:p>
+    <w:p>
+      <w:pPr>
+        <w:pStyle w:val="Compact"/>
+        <w:numPr>
+          <w:ilvl w:val="0"/>
+          <w:numId w:val="1008"/>
+        </w:numPr>
+      </w:pPr>
+      <w:hyperlink r:id="rId27">
+        <w:r>
+          <w:rPr>
+            <w:rStyle w:val="Hyperlink"/>
+            <w:b/>
+            <w:bCs/>
+          </w:rPr>
+          <w:t xml:space="preserve">Sentinel Trading Bot</w:t>
+        </w:r>
+      </w:hyperlink>
       <w:r>
         <w:rPr>
           <w:b/>
           <w:bCs/>
         </w:rPr>
-        <w:t xml:space="preserve">Cambridge O Levels</w:t>
+        <w:t xml:space="preserve">:</w:t>
       </w:r>
       <w:r>
         <w:t xml:space="preserve"> </w:t>
       </w:r>
       <w:r>
-        <w:t xml:space="preserve">| Beaconhouse | 2017 – 2020</w:t>
-      </w:r>
-    </w:p>
-    <w:bookmarkEnd w:id="23"/>
-    <w:bookmarkEnd w:id="24"/>
+        <w:t xml:space="preserve">automated Binance trading bot with an adaptive strategy that learns from past trades and uses Fear &amp; Greed and Reddit sentiment signals.</w:t>
+      </w:r>
+    </w:p>
+    <w:bookmarkEnd w:id="28"/>
+    <w:bookmarkEnd w:id="29"/>
+    <w:bookmarkStart w:id="32" w:name="education"/>
+    <w:p>
+      <w:pPr>
+        <w:pStyle w:val="Heading2"/>
+      </w:pPr>
+      <w:r>
+        <w:t xml:space="preserve">EDUCATION</w:t>
+      </w:r>
+    </w:p>
+    <w:bookmarkStart w:id="30" w:name="bs-artificial-intelligence"/>
+    <w:p>
+      <w:pPr>
+        <w:pStyle w:val="Heading3"/>
+      </w:pPr>
+      <w:r>
+        <w:t xml:space="preserve">BS Artificial Intelligence</w:t>
+      </w:r>
+    </w:p>
+    <w:p>
+      <w:pPr>
+        <w:pStyle w:val="FirstParagraph"/>
+      </w:pPr>
+      <w:r>
+        <w:t xml:space="preserve">FAST-NUCES, Islamabad | 2022 – 2026 (Expected)</w:t>
+      </w:r>
+    </w:p>
+    <w:p>
+      <w:pPr>
+        <w:pStyle w:val="BodyText"/>
+      </w:pPr>
+      <w:r>
+        <w:t xml:space="preserve">Relevant coursework: Deep Learning, Natural Language Processing, Computer Vision, Generative AI, Databases, Software Engineering, Data Structures &amp; Algorithms, Probability &amp; Statistics.</w:t>
+      </w:r>
+    </w:p>
+    <w:bookmarkEnd w:id="30"/>
+    <w:bookmarkStart w:id="31" w:name="cambridge-a-levels-and-o-levels"/>
+    <w:p>
+      <w:pPr>
+        <w:pStyle w:val="Heading3"/>
+      </w:pPr>
+      <w:r>
+        <w:t xml:space="preserve">Cambridge A Levels and O Levels</w:t>
+      </w:r>
+    </w:p>
+    <w:p>
+      <w:pPr>
+        <w:pStyle w:val="FirstParagraph"/>
+      </w:pPr>
+      <w:r>
+        <w:t xml:space="preserve">Beaconhouse School System | 2017 – 2022</w:t>
+      </w:r>
+    </w:p>
+    <w:bookmarkEnd w:id="31"/>
+    <w:bookmarkEnd w:id="32"/>
+    <w:bookmarkEnd w:id="33"/>
     <w:sectPr>
       <w:footnotePr>
         <w:numRestart w:val="eachSect"/>
@@ -863,6 +992,9 @@
     <w:abstractNumId w:val="991"/>
   </w:num>
   <w:num w:numId="1007">
+    <w:abstractNumId w:val="991"/>
+  </w:num>
+  <w:num w:numId="1008">
     <w:abstractNumId w:val="991"/>
   </w:num>
 </w:numbering>

</xml_diff>